<commit_message>
Strengthen RNN three-level assignments and accuracy grading
</commit_message>
<xml_diff>
--- a/docs/03_RNN模型组合探索实验报告模板.docx
+++ b/docs/03_RNN模型组合探索实验报告模板.docx
@@ -696,7 +696,7 @@
         <w:rPr>
           <w:lang w:eastAsia="zh-CN"/>
         </w:rPr>
-        <w:t>任务是中文评论正负面二分类，使用项目既有数据划分。按实际完成等级填写，未开展注明即可；人工短句不计入正式成绩，不按 Accuracy 高低排名。</w:t>
+        <w:t>中文评论正负面二分类。成绩＝100×最终测试Accuracy（0到1）×等级系数：一级0.8、二级0.9、三级1.0。所选模型须通过对应等级验收。</w:t>
       </w:r>
     </w:p>
     <w:tbl>
@@ -902,7 +902,7 @@
                 <w:sz w:val="19"/>
                 <w:lang w:eastAsia="zh-CN"/>
               </w:rPr>
-              <w:t>运行默认模型，改一个参数，保留两组结果</w:t>
+              <w:t>基线、两组学习率候选、一次有理由的后续实验；系数0.8</w:t>
             </w:r>
           </w:p>
         </w:tc>
@@ -993,7 +993,7 @@
                 <w:sz w:val="19"/>
                 <w:lang w:eastAsia="zh-CN"/>
               </w:rPr>
-              <w:t>按提示补全，先检查再训练</w:t>
+              <w:t>补全、语义与梯度检查、受控比较；系数0.9</w:t>
             </w:r>
           </w:p>
         </w:tc>
@@ -1086,7 +1086,7 @@
                 <w:sz w:val="19"/>
                 <w:lang w:eastAsia="zh-CN"/>
               </w:rPr>
-              <w:t xml:space="preserve">允许 </w:t>
+              <w:t>自行实现GRU和A/B设计对照；系数1.0</w:t>
             </w:r>
             <w:proofErr w:type="spellStart"/>
             <w:r>
@@ -1094,7 +1094,6 @@
                 <w:sz w:val="19"/>
                 <w:lang w:eastAsia="zh-CN"/>
               </w:rPr>
-              <w:t>nn.GRU</w:t>
             </w:r>
             <w:proofErr w:type="spellEnd"/>
             <w:r>
@@ -1102,7 +1101,6 @@
                 <w:sz w:val="19"/>
                 <w:lang w:eastAsia="zh-CN"/>
               </w:rPr>
-              <w:t>，自行搭建完整分类器并接入训练</w:t>
             </w:r>
           </w:p>
         </w:tc>
@@ -1128,7 +1126,41 @@
         <w:rPr>
           <w:lang w:eastAsia="zh-CN"/>
         </w:rPr>
-        <w:t>入口：03_rnn_lab/06_text_classification/03_自主修改与挑战.ipynb。默认只运行一级；RUN_LEVEL2 / RUN_LEVEL3 独立开启，三级不依赖二级。</w:t>
+        <w:t>入口：文本03自主修改与挑战。默认一级粗筛；二、三级独立开启，模型TODO由学生完成。</w:t>
+      </w:r>
+    </w:p>
+    <w:p>
+      <w:pPr>
+        <w:pStyle w:val="1"/>
+        <w:rPr>
+          <w:lang w:eastAsia="zh-CN"/>
+        </w:rPr>
+      </w:pPr>
+      <w:r>
+        <w:rPr>
+          <w:lang w:eastAsia="zh-CN"/>
+        </w:rPr>
+        <w:t>一 第一级 调参</w:t>
+      </w:r>
+      <w:r>
+        <w:rPr>
+          <w:lang w:eastAsia="zh-CN"/>
+        </w:rPr>
+      </w:r>
+      <w:r>
+        <w:rPr>
+          <w:lang w:eastAsia="zh-CN"/>
+        </w:rPr>
+      </w:r>
+      <w:r>
+        <w:rPr>
+          <w:lang w:eastAsia="zh-CN"/>
+        </w:rPr>
+      </w:r>
+      <w:r>
+        <w:rPr>
+          <w:lang w:eastAsia="zh-CN"/>
+        </w:rPr>
       </w:r>
     </w:p>
     <w:p>
@@ -1142,59 +1174,7 @@
         <w:rPr>
           <w:lang w:eastAsia="zh-CN"/>
         </w:rPr>
-        <w:t>参考输出不能当个人成绩；填写本人实际运行结果，保留运行编号、Notebook、配置和 CSV 供核对。</w:t>
-      </w:r>
-    </w:p>
-    <w:p>
-      <w:pPr>
-        <w:pStyle w:val="1"/>
-        <w:rPr>
-          <w:lang w:eastAsia="zh-CN"/>
-        </w:rPr>
-      </w:pPr>
-      <w:r>
-        <w:rPr>
-          <w:lang w:eastAsia="zh-CN"/>
-        </w:rPr>
-        <w:t>一</w:t>
-      </w:r>
-      <w:r>
-        <w:rPr>
-          <w:lang w:eastAsia="zh-CN"/>
-        </w:rPr>
-        <w:t xml:space="preserve"> </w:t>
-      </w:r>
-      <w:r>
-        <w:rPr>
-          <w:lang w:eastAsia="zh-CN"/>
-        </w:rPr>
-        <w:t>第一级</w:t>
-      </w:r>
-      <w:r>
-        <w:rPr>
-          <w:lang w:eastAsia="zh-CN"/>
-        </w:rPr>
-        <w:t xml:space="preserve"> </w:t>
-      </w:r>
-      <w:r>
-        <w:rPr>
-          <w:lang w:eastAsia="zh-CN"/>
-        </w:rPr>
-        <w:t>运行与调参</w:t>
-      </w:r>
-    </w:p>
-    <w:p>
-      <w:pPr>
-        <w:spacing w:after="80" w:line="269" w:lineRule="auto"/>
-        <w:rPr>
-          <w:rFonts w:hint="eastAsia"/>
-        </w:rPr>
-      </w:pPr>
-      <w:r>
-        <w:rPr>
-          <w:lang w:eastAsia="zh-CN"/>
-        </w:rPr>
-        <w:t>完整模型：Embedding → 普通 RNN → 有效句尾 → Linear。先运行默认模型，再只改学习率、隐藏维度、轮数、batch 或最大长度中的一项。结果变差也如实记录。</w:t>
+        <w:t>完整RNN先运行基线及两组学习率候选，再依据曲线提出一次后续单参数实验，至少保留4组。结果变差也如实记录。</w:t>
       </w:r>
     </w:p>
     <w:tbl>
@@ -1687,6 +1667,120 @@
           </w:p>
         </w:tc>
       </w:tr>
+      <w:tr>
+        <w:trPr>
+          <w:cantSplit/>
+          <w:jc w:val="center"/>
+        </w:trPr>
+        <w:tc>
+          <w:tcPr>
+            <w:tcW w:w="2154" w:type="dxa"/>
+            <w:shd w:val="clear" w:color="auto" w:fill="F2F6FC"/>
+            <w:tcMar>
+              <w:top w:w="75" w:type="dxa"/>
+              <w:left w:w="90" w:type="dxa"/>
+              <w:bottom w:w="75" w:type="dxa"/>
+              <w:right w:w="90" w:type="dxa"/>
+            </w:tcMar>
+            <w:vAlign w:val="center"/>
+          </w:tcPr>
+          <w:p>
+            <w:pPr>
+              <w:spacing w:after="0" w:line="259" w:lineRule="auto"/>
+              <w:rPr>
+                <w:rFonts w:hint="eastAsia"/>
+              </w:rPr>
+            </w:pPr>
+            <w:r>
+              <w:rPr>
+                <w:sz w:val="19"/>
+              </w:rPr>
+              <w:t>优化器 / 权重衰减</w:t>
+            </w:r>
+          </w:p>
+        </w:tc>
+        <w:tc>
+          <w:tcPr>
+            <w:tcW w:w="2665" w:type="dxa"/>
+            <w:shd w:val="clear" w:color="auto" w:fill="F2F6FC"/>
+            <w:tcMar>
+              <w:top w:w="75" w:type="dxa"/>
+              <w:left w:w="90" w:type="dxa"/>
+              <w:bottom w:w="75" w:type="dxa"/>
+              <w:right w:w="90" w:type="dxa"/>
+            </w:tcMar>
+            <w:vAlign w:val="center"/>
+          </w:tcPr>
+          <w:p>
+            <w:pPr>
+              <w:spacing w:after="0" w:line="259" w:lineRule="auto"/>
+              <w:rPr>
+                <w:rFonts w:hint="eastAsia"/>
+              </w:rPr>
+            </w:pPr>
+            <w:r>
+              <w:rPr>
+                <w:sz w:val="19"/>
+              </w:rPr>
+              <w:t>【填写】</w:t>
+            </w:r>
+          </w:p>
+        </w:tc>
+        <w:tc>
+          <w:tcPr>
+            <w:tcW w:w="2154" w:type="dxa"/>
+            <w:shd w:val="clear" w:color="auto" w:fill="F2F6FC"/>
+            <w:tcMar>
+              <w:top w:w="75" w:type="dxa"/>
+              <w:left w:w="90" w:type="dxa"/>
+              <w:bottom w:w="75" w:type="dxa"/>
+              <w:right w:w="90" w:type="dxa"/>
+            </w:tcMar>
+            <w:vAlign w:val="center"/>
+          </w:tcPr>
+          <w:p>
+            <w:pPr>
+              <w:spacing w:after="0" w:line="259" w:lineRule="auto"/>
+              <w:rPr>
+                <w:rFonts w:hint="eastAsia"/>
+              </w:rPr>
+            </w:pPr>
+            <w:r>
+              <w:rPr>
+                <w:sz w:val="19"/>
+              </w:rPr>
+              <w:t>梯度裁剪 / 选轮规则</w:t>
+            </w:r>
+          </w:p>
+        </w:tc>
+        <w:tc>
+          <w:tcPr>
+            <w:tcW w:w="2665" w:type="dxa"/>
+            <w:shd w:val="clear" w:color="auto" w:fill="F2F6FC"/>
+            <w:tcMar>
+              <w:top w:w="75" w:type="dxa"/>
+              <w:left w:w="90" w:type="dxa"/>
+              <w:bottom w:w="75" w:type="dxa"/>
+              <w:right w:w="90" w:type="dxa"/>
+            </w:tcMar>
+            <w:vAlign w:val="center"/>
+          </w:tcPr>
+          <w:p>
+            <w:pPr>
+              <w:spacing w:after="0" w:line="259" w:lineRule="auto"/>
+              <w:rPr>
+                <w:rFonts w:hint="eastAsia"/>
+              </w:rPr>
+            </w:pPr>
+            <w:r>
+              <w:rPr>
+                <w:sz w:val="19"/>
+              </w:rPr>
+              <w:t>【填写】</w:t>
+            </w:r>
+          </w:p>
+        </w:tc>
+      </w:tr>
     </w:tbl>
     <w:p>
       <w:pPr>
@@ -1708,7 +1802,7 @@
         <w:rPr>
           <w:lang w:eastAsia="zh-CN"/>
         </w:rPr>
-        <w:t>我的修改与运行前预测：【参数名；原值 → 新值；其他条件保持什么；预期变化及理由】</w:t>
+        <w:t>后续实验与运行前预测：【父实验编号；只改哪个参数、原值→新值；曲线依据；预期变化及理由】</w:t>
       </w:r>
     </w:p>
     <w:tbl>
@@ -1826,7 +1920,7 @@
                 <w:color w:val="FFFFFF"/>
                 <w:sz w:val="19"/>
               </w:rPr>
-              <w:t>验证 Accuracy %</w:t>
+              <w:t>验证准确率 %</w:t>
             </w:r>
           </w:p>
         </w:tc>
@@ -1856,7 +1950,7 @@
                 <w:color w:val="FFFFFF"/>
                 <w:sz w:val="19"/>
               </w:rPr>
-              <w:t>验证 Macro F1 %</w:t>
+              <w:t>验证宏F1 %</w:t>
             </w:r>
           </w:p>
         </w:tc>
@@ -1949,7 +2043,7 @@
               <w:rPr>
                 <w:sz w:val="19"/>
               </w:rPr>
-              <w:t>RNN 默认</w:t>
+              <w:t>基线</w:t>
             </w:r>
           </w:p>
         </w:tc>
@@ -2117,7 +2211,343 @@
               <w:rPr>
                 <w:sz w:val="19"/>
               </w:rPr>
-              <w:t>RNN 调参</w:t>
+              <w:t>候选1</w:t>
+            </w:r>
+          </w:p>
+        </w:tc>
+        <w:tc>
+          <w:tcPr>
+            <w:tcW w:w="1757" w:type="dxa"/>
+            <w:shd w:val="clear" w:color="auto" w:fill="FFFFFF"/>
+            <w:tcMar>
+              <w:top w:w="75" w:type="dxa"/>
+              <w:left w:w="90" w:type="dxa"/>
+              <w:bottom w:w="75" w:type="dxa"/>
+              <w:right w:w="90" w:type="dxa"/>
+            </w:tcMar>
+            <w:vAlign w:val="center"/>
+          </w:tcPr>
+          <w:p>
+            <w:pPr>
+              <w:spacing w:after="0" w:line="259" w:lineRule="auto"/>
+              <w:rPr>
+                <w:rFonts w:hint="eastAsia"/>
+              </w:rPr>
+            </w:pPr>
+            <w:r>
+              <w:rPr>
+                <w:sz w:val="19"/>
+              </w:rPr>
+              <w:t>【填写】</w:t>
+            </w:r>
+          </w:p>
+        </w:tc>
+        <w:tc>
+          <w:tcPr>
+            <w:tcW w:w="1701" w:type="dxa"/>
+            <w:shd w:val="clear" w:color="auto" w:fill="FFFFFF"/>
+            <w:tcMar>
+              <w:top w:w="75" w:type="dxa"/>
+              <w:left w:w="90" w:type="dxa"/>
+              <w:bottom w:w="75" w:type="dxa"/>
+              <w:right w:w="90" w:type="dxa"/>
+            </w:tcMar>
+            <w:vAlign w:val="center"/>
+          </w:tcPr>
+          <w:p>
+            <w:pPr>
+              <w:spacing w:after="0" w:line="259" w:lineRule="auto"/>
+              <w:rPr>
+                <w:rFonts w:hint="eastAsia"/>
+              </w:rPr>
+            </w:pPr>
+            <w:r>
+              <w:rPr>
+                <w:sz w:val="19"/>
+              </w:rPr>
+              <w:t>【填写】</w:t>
+            </w:r>
+          </w:p>
+        </w:tc>
+        <w:tc>
+          <w:tcPr>
+            <w:tcW w:w="1701" w:type="dxa"/>
+            <w:shd w:val="clear" w:color="auto" w:fill="FFFFFF"/>
+            <w:tcMar>
+              <w:top w:w="75" w:type="dxa"/>
+              <w:left w:w="90" w:type="dxa"/>
+              <w:bottom w:w="75" w:type="dxa"/>
+              <w:right w:w="90" w:type="dxa"/>
+            </w:tcMar>
+            <w:vAlign w:val="center"/>
+          </w:tcPr>
+          <w:p>
+            <w:pPr>
+              <w:spacing w:after="0" w:line="259" w:lineRule="auto"/>
+              <w:rPr>
+                <w:rFonts w:hint="eastAsia"/>
+              </w:rPr>
+            </w:pPr>
+            <w:r>
+              <w:rPr>
+                <w:sz w:val="19"/>
+              </w:rPr>
+              <w:t>【填写】</w:t>
+            </w:r>
+          </w:p>
+        </w:tc>
+        <w:tc>
+          <w:tcPr>
+            <w:tcW w:w="1361" w:type="dxa"/>
+            <w:shd w:val="clear" w:color="auto" w:fill="FFFFFF"/>
+            <w:tcMar>
+              <w:top w:w="75" w:type="dxa"/>
+              <w:left w:w="90" w:type="dxa"/>
+              <w:bottom w:w="75" w:type="dxa"/>
+              <w:right w:w="90" w:type="dxa"/>
+            </w:tcMar>
+            <w:vAlign w:val="center"/>
+          </w:tcPr>
+          <w:p>
+            <w:pPr>
+              <w:spacing w:after="0" w:line="259" w:lineRule="auto"/>
+              <w:rPr>
+                <w:rFonts w:hint="eastAsia"/>
+              </w:rPr>
+            </w:pPr>
+            <w:r>
+              <w:rPr>
+                <w:sz w:val="19"/>
+              </w:rPr>
+              <w:t>【填写】</w:t>
+            </w:r>
+          </w:p>
+        </w:tc>
+        <w:tc>
+          <w:tcPr>
+            <w:tcW w:w="1984" w:type="dxa"/>
+            <w:shd w:val="clear" w:color="auto" w:fill="FFFFFF"/>
+            <w:tcMar>
+              <w:top w:w="75" w:type="dxa"/>
+              <w:left w:w="90" w:type="dxa"/>
+              <w:bottom w:w="75" w:type="dxa"/>
+              <w:right w:w="90" w:type="dxa"/>
+            </w:tcMar>
+            <w:vAlign w:val="center"/>
+          </w:tcPr>
+          <w:p>
+            <w:pPr>
+              <w:spacing w:after="0" w:line="259" w:lineRule="auto"/>
+              <w:rPr>
+                <w:rFonts w:hint="eastAsia"/>
+              </w:rPr>
+            </w:pPr>
+            <w:r>
+              <w:rPr>
+                <w:sz w:val="19"/>
+              </w:rPr>
+              <w:t>【填写】</w:t>
+            </w:r>
+          </w:p>
+        </w:tc>
+      </w:tr>
+      <w:tr>
+        <w:trPr>
+          <w:cantSplit/>
+          <w:jc w:val="center"/>
+        </w:trPr>
+        <w:tc>
+          <w:tcPr>
+            <w:tcW w:w="1134" w:type="dxa"/>
+            <w:shd w:val="clear" w:color="auto" w:fill="FFFFFF"/>
+            <w:tcMar>
+              <w:top w:w="75" w:type="dxa"/>
+              <w:left w:w="90" w:type="dxa"/>
+              <w:bottom w:w="75" w:type="dxa"/>
+              <w:right w:w="90" w:type="dxa"/>
+            </w:tcMar>
+            <w:vAlign w:val="center"/>
+          </w:tcPr>
+          <w:p>
+            <w:pPr>
+              <w:spacing w:after="0" w:line="259" w:lineRule="auto"/>
+              <w:rPr>
+                <w:rFonts w:hint="eastAsia"/>
+              </w:rPr>
+            </w:pPr>
+            <w:r>
+              <w:rPr>
+                <w:sz w:val="19"/>
+              </w:rPr>
+              <w:t>候选2</w:t>
+            </w:r>
+          </w:p>
+        </w:tc>
+        <w:tc>
+          <w:tcPr>
+            <w:tcW w:w="1757" w:type="dxa"/>
+            <w:shd w:val="clear" w:color="auto" w:fill="FFFFFF"/>
+            <w:tcMar>
+              <w:top w:w="75" w:type="dxa"/>
+              <w:left w:w="90" w:type="dxa"/>
+              <w:bottom w:w="75" w:type="dxa"/>
+              <w:right w:w="90" w:type="dxa"/>
+            </w:tcMar>
+            <w:vAlign w:val="center"/>
+          </w:tcPr>
+          <w:p>
+            <w:pPr>
+              <w:spacing w:after="0" w:line="259" w:lineRule="auto"/>
+              <w:rPr>
+                <w:rFonts w:hint="eastAsia"/>
+              </w:rPr>
+            </w:pPr>
+            <w:r>
+              <w:rPr>
+                <w:sz w:val="19"/>
+              </w:rPr>
+              <w:t>【填写】</w:t>
+            </w:r>
+          </w:p>
+        </w:tc>
+        <w:tc>
+          <w:tcPr>
+            <w:tcW w:w="1701" w:type="dxa"/>
+            <w:shd w:val="clear" w:color="auto" w:fill="FFFFFF"/>
+            <w:tcMar>
+              <w:top w:w="75" w:type="dxa"/>
+              <w:left w:w="90" w:type="dxa"/>
+              <w:bottom w:w="75" w:type="dxa"/>
+              <w:right w:w="90" w:type="dxa"/>
+            </w:tcMar>
+            <w:vAlign w:val="center"/>
+          </w:tcPr>
+          <w:p>
+            <w:pPr>
+              <w:spacing w:after="0" w:line="259" w:lineRule="auto"/>
+              <w:rPr>
+                <w:rFonts w:hint="eastAsia"/>
+              </w:rPr>
+            </w:pPr>
+            <w:r>
+              <w:rPr>
+                <w:sz w:val="19"/>
+              </w:rPr>
+              <w:t>【填写】</w:t>
+            </w:r>
+          </w:p>
+        </w:tc>
+        <w:tc>
+          <w:tcPr>
+            <w:tcW w:w="1701" w:type="dxa"/>
+            <w:shd w:val="clear" w:color="auto" w:fill="FFFFFF"/>
+            <w:tcMar>
+              <w:top w:w="75" w:type="dxa"/>
+              <w:left w:w="90" w:type="dxa"/>
+              <w:bottom w:w="75" w:type="dxa"/>
+              <w:right w:w="90" w:type="dxa"/>
+            </w:tcMar>
+            <w:vAlign w:val="center"/>
+          </w:tcPr>
+          <w:p>
+            <w:pPr>
+              <w:spacing w:after="0" w:line="259" w:lineRule="auto"/>
+              <w:rPr>
+                <w:rFonts w:hint="eastAsia"/>
+              </w:rPr>
+            </w:pPr>
+            <w:r>
+              <w:rPr>
+                <w:sz w:val="19"/>
+              </w:rPr>
+              <w:t>【填写】</w:t>
+            </w:r>
+          </w:p>
+        </w:tc>
+        <w:tc>
+          <w:tcPr>
+            <w:tcW w:w="1361" w:type="dxa"/>
+            <w:shd w:val="clear" w:color="auto" w:fill="FFFFFF"/>
+            <w:tcMar>
+              <w:top w:w="75" w:type="dxa"/>
+              <w:left w:w="90" w:type="dxa"/>
+              <w:bottom w:w="75" w:type="dxa"/>
+              <w:right w:w="90" w:type="dxa"/>
+            </w:tcMar>
+            <w:vAlign w:val="center"/>
+          </w:tcPr>
+          <w:p>
+            <w:pPr>
+              <w:spacing w:after="0" w:line="259" w:lineRule="auto"/>
+              <w:rPr>
+                <w:rFonts w:hint="eastAsia"/>
+              </w:rPr>
+            </w:pPr>
+            <w:r>
+              <w:rPr>
+                <w:sz w:val="19"/>
+              </w:rPr>
+              <w:t>【填写】</w:t>
+            </w:r>
+          </w:p>
+        </w:tc>
+        <w:tc>
+          <w:tcPr>
+            <w:tcW w:w="1984" w:type="dxa"/>
+            <w:shd w:val="clear" w:color="auto" w:fill="FFFFFF"/>
+            <w:tcMar>
+              <w:top w:w="75" w:type="dxa"/>
+              <w:left w:w="90" w:type="dxa"/>
+              <w:bottom w:w="75" w:type="dxa"/>
+              <w:right w:w="90" w:type="dxa"/>
+            </w:tcMar>
+            <w:vAlign w:val="center"/>
+          </w:tcPr>
+          <w:p>
+            <w:pPr>
+              <w:spacing w:after="0" w:line="259" w:lineRule="auto"/>
+              <w:rPr>
+                <w:rFonts w:hint="eastAsia"/>
+              </w:rPr>
+            </w:pPr>
+            <w:r>
+              <w:rPr>
+                <w:sz w:val="19"/>
+              </w:rPr>
+              <w:t>【填写】</w:t>
+            </w:r>
+          </w:p>
+        </w:tc>
+      </w:tr>
+      <w:tr>
+        <w:trPr>
+          <w:cantSplit/>
+          <w:jc w:val="center"/>
+        </w:trPr>
+        <w:tc>
+          <w:tcPr>
+            <w:tcW w:w="1134" w:type="dxa"/>
+            <w:shd w:val="clear" w:color="auto" w:fill="FFFFFF"/>
+            <w:tcMar>
+              <w:top w:w="75" w:type="dxa"/>
+              <w:left w:w="90" w:type="dxa"/>
+              <w:bottom w:w="75" w:type="dxa"/>
+              <w:right w:w="90" w:type="dxa"/>
+            </w:tcMar>
+            <w:vAlign w:val="center"/>
+          </w:tcPr>
+          <w:p>
+            <w:pPr>
+              <w:spacing w:after="0" w:line="259" w:lineRule="auto"/>
+              <w:rPr>
+                <w:rFonts w:hint="eastAsia"/>
+              </w:rPr>
+            </w:pPr>
+            <w:r>
+              <w:rPr>
+                <w:sz w:val="19"/>
+              </w:rPr>
+              <w:t>后续实验</w:t>
             </w:r>
           </w:p>
         </w:tc>
@@ -2278,7 +2708,7 @@
         <w:rPr>
           <w:lang w:eastAsia="zh-CN"/>
         </w:rPr>
-        <w:t>运行目录或汇总 CSV：【填写】。Accuracy / F1 统一按百分数填写；参数量和耗时引用程序实际输出。未记录的内容注明“未记录”，不推测。</w:t>
+        <w:t>运行目录/CSV：【填写】。表中Accuracy/F1填百分数；各组保存轮次与更新次数：【填写】。按验证Accuracy选轮，同分看Loss，再同分取早轮。</w:t>
       </w:r>
     </w:p>
     <w:p>
@@ -2321,7 +2751,7 @@
         <w:rPr>
           <w:lang w:eastAsia="zh-CN"/>
         </w:rPr>
-        <w:t>图表来自自己的两次运行，注明运行编号并保留坐标、图例和标题。粘贴为“嵌入型”，建议宽度不超过 16 cm；可以增加段落和页面。</w:t>
+        <w:t>图来自本人实际运行，注明编号，保留坐标和图例。粘贴为嵌入型，宽不超过16cm；可增加页面。</w:t>
       </w:r>
     </w:p>
     <w:p>
@@ -2362,7 +2792,7 @@
         <w:rPr>
           <w:lang w:eastAsia="zh-CN"/>
         </w:rPr>
-        <w:t>对应运行：【默认 / 调参的实际编号】</w:t>
+        <w:t>对应运行：【基线、学习率候选与后续实验编号】</w:t>
       </w:r>
     </w:p>
     <w:p>
@@ -2377,7 +2807,7 @@
         <w:rPr>
           <w:lang w:eastAsia="zh-CN"/>
         </w:rPr>
-        <w:t>【在此插入本次运行的曲线；可并列或叠加比较默认与调参】</w:t>
+        <w:t>【插入能支持调参判断的训练/验证曲线；必要时附裁剪前梯度曲线】</w:t>
       </w:r>
     </w:p>
     <w:p>
@@ -2392,7 +2822,7 @@
         <w:rPr>
           <w:lang w:eastAsia="zh-CN"/>
         </w:rPr>
-        <w:t>我的观察：【Loss 下降、震荡或平台；训练与验证的差异；是否支持运行前预测】</w:t>
+        <w:t>我的观察：【训练与验证的变化、保存轮次；哪些证据促使我开展下一次实验；结果是否支持预测】</w:t>
       </w:r>
     </w:p>
     <w:p>
@@ -2463,7 +2893,7 @@
         <w:rPr>
           <w:lang w:eastAsia="zh-CN"/>
         </w:rPr>
-        <w:t>我的解释：【指出哪类更容易错，引用格内数量；不能只写“准确率较高”】</w:t>
+        <w:t>我的解释：【引用格内数量说明哪类更容易错，提出待检验的原因】</w:t>
       </w:r>
     </w:p>
     <w:p>
@@ -2809,7 +3239,7 @@
         <w:rPr>
           <w:lang w:eastAsia="zh-CN"/>
         </w:rPr>
-        <w:t>本级结论：【引用两次结果和图，解释修改带来的变化与代价；单次结果不代表某种设置总是更好】</w:t>
+        <w:t>本级结论：【引用至少4组记录，解释后续调整的结果与代价；改batch时说明更新次数；单次结果不代表普遍优越】</w:t>
       </w:r>
     </w:p>
     <w:p>
@@ -2824,38 +3254,32 @@
         <w:rPr>
           <w:lang w:eastAsia="zh-CN"/>
         </w:rPr>
-        <w:lastRenderedPageBreak/>
-        <w:t>二</w:t>
+        <w:t>二 第二级 完善 LSTM</w:t>
       </w:r>
       <w:r>
         <w:rPr>
           <w:lang w:eastAsia="zh-CN"/>
         </w:rPr>
-        <w:t xml:space="preserve"> </w:t>
       </w:r>
       <w:r>
         <w:rPr>
           <w:lang w:eastAsia="zh-CN"/>
         </w:rPr>
-        <w:t>第二级</w:t>
       </w:r>
       <w:r>
         <w:rPr>
           <w:lang w:eastAsia="zh-CN"/>
         </w:rPr>
-        <w:t xml:space="preserve"> </w:t>
       </w:r>
       <w:r>
         <w:rPr>
           <w:lang w:eastAsia="zh-CN"/>
         </w:rPr>
-        <w:t>补全</w:t>
       </w:r>
       <w:r>
         <w:rPr>
           <w:lang w:eastAsia="zh-CN"/>
         </w:rPr>
-        <w:t xml:space="preserve"> LSTM</w:t>
       </w:r>
     </w:p>
     <w:p>
@@ -3219,21 +3643,19 @@
         <w:rPr>
           <w:lang w:eastAsia="zh-CN"/>
         </w:rPr>
-        <w:t>输入 token_ids 为 int64 [B,T]，lengths 为 [B]；循环输出为 [B,T,H]；分类输出为 [B,2] logits，forward 不提前 softmax。LSTM 的 (</w:t>
+        <w:t>检查输入[B,T]、长度[B]、输出[B,2] logits。核对LSTM返回值、有效句尾和PAD。新增人工状态检查实际读出；小批次反传检查各层连接，不更新参数。</w:t>
       </w:r>
       <w:proofErr w:type="spellStart"/>
       <w:r>
         <w:rPr>
           <w:lang w:eastAsia="zh-CN"/>
         </w:rPr>
-        <w:t>h_n,c_n</w:t>
       </w:r>
       <w:proofErr w:type="spellEnd"/>
       <w:r>
         <w:rPr>
           <w:lang w:eastAsia="zh-CN"/>
         </w:rPr>
-        <w:t>) 与全部时间步输出不是同一项。</w:t>
       </w:r>
     </w:p>
     <w:tbl>
@@ -3524,6 +3946,134 @@
                 <w:lang w:eastAsia="zh-CN"/>
               </w:rPr>
               <w:t>【填写检查输出或最大差异】</w:t>
+            </w:r>
+          </w:p>
+        </w:tc>
+      </w:tr>
+      <w:tr>
+        <w:trPr>
+          <w:cantSplit/>
+          <w:jc w:val="center"/>
+        </w:trPr>
+        <w:tc>
+          <w:tcPr>
+            <w:tcW w:w="3969" w:type="dxa"/>
+            <w:shd w:val="clear" w:color="auto" w:fill="F2F6FC"/>
+            <w:tcMar>
+              <w:top w:w="75" w:type="dxa"/>
+              <w:left w:w="90" w:type="dxa"/>
+              <w:bottom w:w="75" w:type="dxa"/>
+              <w:right w:w="90" w:type="dxa"/>
+            </w:tcMar>
+            <w:vAlign w:val="center"/>
+          </w:tcPr>
+          <w:p>
+            <w:pPr>
+              <w:spacing w:after="0" w:line="259" w:lineRule="auto"/>
+              <w:rPr>
+                <w:rFonts w:hint="eastAsia"/>
+                <w:lang w:eastAsia="zh-CN"/>
+              </w:rPr>
+            </w:pPr>
+            <w:r>
+              <w:rPr>
+                <w:sz w:val="19"/>
+                <w:lang w:eastAsia="zh-CN"/>
+              </w:rPr>
+              <w:t>实际读出符合声明（last / mean）</w:t>
+            </w:r>
+          </w:p>
+        </w:tc>
+        <w:tc>
+          <w:tcPr>
+            <w:tcW w:w="5669" w:type="dxa"/>
+            <w:shd w:val="clear" w:color="auto" w:fill="F2F6FC"/>
+            <w:tcMar>
+              <w:top w:w="75" w:type="dxa"/>
+              <w:left w:w="90" w:type="dxa"/>
+              <w:bottom w:w="75" w:type="dxa"/>
+              <w:right w:w="90" w:type="dxa"/>
+            </w:tcMar>
+            <w:vAlign w:val="center"/>
+          </w:tcPr>
+          <w:p>
+            <w:pPr>
+              <w:spacing w:after="0" w:line="259" w:lineRule="auto"/>
+              <w:rPr>
+                <w:rFonts w:hint="eastAsia"/>
+                <w:lang w:eastAsia="zh-CN"/>
+              </w:rPr>
+            </w:pPr>
+            <w:r>
+              <w:rPr>
+                <w:sz w:val="19"/>
+                <w:lang w:eastAsia="zh-CN"/>
+              </w:rPr>
+              <w:t>【填写】</w:t>
+            </w:r>
+          </w:p>
+        </w:tc>
+      </w:tr>
+      <w:tr>
+        <w:trPr>
+          <w:cantSplit/>
+          <w:jc w:val="center"/>
+        </w:trPr>
+        <w:tc>
+          <w:tcPr>
+            <w:tcW w:w="3969" w:type="dxa"/>
+            <w:shd w:val="clear" w:color="auto" w:fill="F2F6FC"/>
+            <w:tcMar>
+              <w:top w:w="75" w:type="dxa"/>
+              <w:left w:w="90" w:type="dxa"/>
+              <w:bottom w:w="75" w:type="dxa"/>
+              <w:right w:w="90" w:type="dxa"/>
+            </w:tcMar>
+            <w:vAlign w:val="center"/>
+          </w:tcPr>
+          <w:p>
+            <w:pPr>
+              <w:spacing w:after="0" w:line="259" w:lineRule="auto"/>
+              <w:rPr>
+                <w:rFonts w:hint="eastAsia"/>
+                <w:lang w:eastAsia="zh-CN"/>
+              </w:rPr>
+            </w:pPr>
+            <w:r>
+              <w:rPr>
+                <w:sz w:val="19"/>
+                <w:lang w:eastAsia="zh-CN"/>
+              </w:rPr>
+              <w:t>Embedding、循环层、分类层梯度连接</w:t>
+            </w:r>
+          </w:p>
+        </w:tc>
+        <w:tc>
+          <w:tcPr>
+            <w:tcW w:w="5669" w:type="dxa"/>
+            <w:shd w:val="clear" w:color="auto" w:fill="F2F6FC"/>
+            <w:tcMar>
+              <w:top w:w="75" w:type="dxa"/>
+              <w:left w:w="90" w:type="dxa"/>
+              <w:bottom w:w="75" w:type="dxa"/>
+              <w:right w:w="90" w:type="dxa"/>
+            </w:tcMar>
+            <w:vAlign w:val="center"/>
+          </w:tcPr>
+          <w:p>
+            <w:pPr>
+              <w:spacing w:after="0" w:line="259" w:lineRule="auto"/>
+              <w:rPr>
+                <w:rFonts w:hint="eastAsia"/>
+                <w:lang w:eastAsia="zh-CN"/>
+              </w:rPr>
+            </w:pPr>
+            <w:r>
+              <w:rPr>
+                <w:sz w:val="19"/>
+                <w:lang w:eastAsia="zh-CN"/>
+              </w:rPr>
+              <w:t>【填写】</w:t>
             </w:r>
           </w:p>
         </w:tc>
@@ -3923,7 +4473,7 @@
         <w:rPr>
           <w:lang w:eastAsia="zh-CN"/>
         </w:rPr>
-        <w:t>本级分析：【与一级默认 RNN 相比，效果和代价如何变化；结果是否支持预期；LSTM 不要求一定更优】</w:t>
+        <w:t>本级分析：【与同条件RNN比较，说明效果和代价；分析一条验证错例；结果不要求更优】</w:t>
       </w:r>
     </w:p>
     <w:p>
@@ -3938,38 +4488,32 @@
         <w:rPr>
           <w:lang w:eastAsia="zh-CN"/>
         </w:rPr>
-        <w:lastRenderedPageBreak/>
-        <w:t>三</w:t>
+        <w:t>三 第三级 自行建模与设计对照</w:t>
       </w:r>
       <w:r>
         <w:rPr>
           <w:lang w:eastAsia="zh-CN"/>
         </w:rPr>
-        <w:t xml:space="preserve"> </w:t>
       </w:r>
       <w:r>
         <w:rPr>
           <w:lang w:eastAsia="zh-CN"/>
         </w:rPr>
-        <w:t>第三级</w:t>
       </w:r>
       <w:r>
         <w:rPr>
           <w:lang w:eastAsia="zh-CN"/>
         </w:rPr>
-        <w:t xml:space="preserve"> </w:t>
       </w:r>
       <w:r>
         <w:rPr>
           <w:lang w:eastAsia="zh-CN"/>
         </w:rPr>
-        <w:t>自主搭建</w:t>
       </w:r>
       <w:r>
         <w:rPr>
           <w:lang w:eastAsia="zh-CN"/>
         </w:rPr>
-        <w:t xml:space="preserve"> GRU</w:t>
       </w:r>
     </w:p>
     <w:p>
@@ -3984,35 +4528,31 @@
         <w:rPr>
           <w:lang w:eastAsia="zh-CN"/>
         </w:rPr>
-        <w:t xml:space="preserve">开展状态：□ 已完成　□ 已尝试　□ 未开展。允许 </w:t>
+        <w:t>开展：□ 已完成 □ 已尝试 □ 未开展。使用nn.GRU自行编写完整分类器，并完成A/B单因素设计对照。三级独立于二级；只换循环单元或只运行一个GRU不足以完成本级。</w:t>
       </w:r>
       <w:proofErr w:type="spellStart"/>
       <w:r>
         <w:rPr>
           <w:lang w:eastAsia="zh-CN"/>
         </w:rPr>
-        <w:t>torch.nn.GRU</w:t>
       </w:r>
       <w:proofErr w:type="spellEnd"/>
       <w:r>
         <w:rPr>
           <w:lang w:eastAsia="zh-CN"/>
         </w:rPr>
-        <w:t xml:space="preserve">，自己编写完整模型类与 forward，并显式传入共用训练函数；不通过切换 </w:t>
       </w:r>
       <w:proofErr w:type="spellStart"/>
       <w:r>
         <w:rPr>
           <w:lang w:eastAsia="zh-CN"/>
         </w:rPr>
-        <w:t>cell_type</w:t>
       </w:r>
       <w:proofErr w:type="spellEnd"/>
       <w:r>
         <w:rPr>
           <w:lang w:eastAsia="zh-CN"/>
         </w:rPr>
-        <w:t xml:space="preserve"> 调用教师成品。第三级可独立于第二级开展。</w:t>
       </w:r>
     </w:p>
     <w:p>
@@ -4041,7 +4581,7 @@
         <w:rPr>
           <w:lang w:eastAsia="zh-CN"/>
         </w:rPr>
-        <w:t>模型类与代码位置：【填写】。先确定输入和输出，再画结构、定义各层、连接 forward，最后用小批次检查。</w:t>
+        <w:t>代码位置：【填写】。A/B仅改变读出、H、E或层数之一；固定数据、词表、训练预算、优化器、种子和选轮规则。推荐last与masked mean对照。</w:t>
       </w:r>
     </w:p>
     <w:p>
@@ -4056,7 +4596,7 @@
         <w:rPr>
           <w:lang w:eastAsia="zh-CN"/>
         </w:rPr>
-        <w:t>【画出或插入本人模型结构；标明 Embedding、GRU、句子读出、分类层及各步张量形状】</w:t>
+        <w:t>【画出A/B结构及各步张量形状，标出唯一变化，并在运行前写设计理由与预测】</w:t>
       </w:r>
     </w:p>
     <w:tbl>
@@ -4141,7 +4681,7 @@
                 <w:color w:val="FFFFFF"/>
                 <w:sz w:val="19"/>
               </w:rPr>
-              <w:t>本人设计</w:t>
+              <w:t>A / B设置</w:t>
             </w:r>
           </w:p>
         </w:tc>
@@ -4171,7 +4711,7 @@
                 <w:color w:val="FFFFFF"/>
                 <w:sz w:val="19"/>
               </w:rPr>
-              <w:t>选择理由</w:t>
+              <w:t>理由与预测</w:t>
             </w:r>
           </w:p>
         </w:tc>
@@ -4292,6 +4832,93 @@
                 <w:sz w:val="19"/>
               </w:rPr>
               <w:t>GRU 层数 / 读出方式</w:t>
+            </w:r>
+          </w:p>
+        </w:tc>
+        <w:tc>
+          <w:tcPr>
+            <w:tcW w:w="2948" w:type="dxa"/>
+            <w:shd w:val="clear" w:color="auto" w:fill="FFFFFF"/>
+            <w:tcMar>
+              <w:top w:w="75" w:type="dxa"/>
+              <w:left w:w="90" w:type="dxa"/>
+              <w:bottom w:w="75" w:type="dxa"/>
+              <w:right w:w="90" w:type="dxa"/>
+            </w:tcMar>
+            <w:vAlign w:val="center"/>
+          </w:tcPr>
+          <w:p>
+            <w:pPr>
+              <w:spacing w:after="0" w:line="259" w:lineRule="auto"/>
+              <w:rPr>
+                <w:rFonts w:hint="eastAsia"/>
+              </w:rPr>
+            </w:pPr>
+            <w:r>
+              <w:rPr>
+                <w:sz w:val="19"/>
+              </w:rPr>
+              <w:t>【填写】</w:t>
+            </w:r>
+          </w:p>
+        </w:tc>
+        <w:tc>
+          <w:tcPr>
+            <w:tcW w:w="3742" w:type="dxa"/>
+            <w:shd w:val="clear" w:color="auto" w:fill="FFFFFF"/>
+            <w:tcMar>
+              <w:top w:w="75" w:type="dxa"/>
+              <w:left w:w="90" w:type="dxa"/>
+              <w:bottom w:w="75" w:type="dxa"/>
+              <w:right w:w="90" w:type="dxa"/>
+            </w:tcMar>
+            <w:vAlign w:val="center"/>
+          </w:tcPr>
+          <w:p>
+            <w:pPr>
+              <w:spacing w:after="0" w:line="259" w:lineRule="auto"/>
+              <w:rPr>
+                <w:rFonts w:hint="eastAsia"/>
+              </w:rPr>
+            </w:pPr>
+            <w:r>
+              <w:rPr>
+                <w:sz w:val="19"/>
+              </w:rPr>
+              <w:t>【填写】</w:t>
+            </w:r>
+          </w:p>
+        </w:tc>
+      </w:tr>
+      <w:tr>
+        <w:trPr>
+          <w:cantSplit/>
+          <w:jc w:val="center"/>
+        </w:trPr>
+        <w:tc>
+          <w:tcPr>
+            <w:tcW w:w="2948" w:type="dxa"/>
+            <w:shd w:val="clear" w:color="auto" w:fill="FFFFFF"/>
+            <w:tcMar>
+              <w:top w:w="75" w:type="dxa"/>
+              <w:left w:w="90" w:type="dxa"/>
+              <w:bottom w:w="75" w:type="dxa"/>
+              <w:right w:w="90" w:type="dxa"/>
+            </w:tcMar>
+            <w:vAlign w:val="center"/>
+          </w:tcPr>
+          <w:p>
+            <w:pPr>
+              <w:spacing w:after="0" w:line="259" w:lineRule="auto"/>
+              <w:rPr>
+                <w:rFonts w:hint="eastAsia"/>
+              </w:rPr>
+            </w:pPr>
+            <w:r>
+              <w:rPr>
+                <w:sz w:val="19"/>
+              </w:rPr>
+              <w:t>唯一变化 / 共同条件</w:t>
             </w:r>
           </w:p>
         </w:tc>
@@ -4379,7 +5006,7 @@
         <w:rPr>
           <w:lang w:eastAsia="zh-CN"/>
         </w:rPr>
-        <w:t>【粘贴或解释本人关键代码：如何处理有效长度、返回 [B,2] logits、接入训练；记录输出形状、数值有限、右侧 PAD 与混批检查】</w:t>
+        <w:t>【摘录本人关键代码；分别记录A/B的形状、PAD、读出语义和梯度连接检查，不复制全部训练循环】</w:t>
       </w:r>
     </w:p>
     <w:tbl>
@@ -4589,7 +5216,148 @@
               <w:rPr>
                 <w:sz w:val="19"/>
               </w:rPr>
+              <w:t>A：【编号】</w:t>
+            </w:r>
+          </w:p>
+        </w:tc>
+        <w:tc>
+          <w:tcPr>
+            <w:tcW w:w="1984" w:type="dxa"/>
+            <w:shd w:val="clear" w:color="auto" w:fill="F2F6FC"/>
+            <w:tcMar>
+              <w:top w:w="75" w:type="dxa"/>
+              <w:left w:w="90" w:type="dxa"/>
+              <w:bottom w:w="75" w:type="dxa"/>
+              <w:right w:w="90" w:type="dxa"/>
+            </w:tcMar>
+            <w:vAlign w:val="center"/>
+          </w:tcPr>
+          <w:p>
+            <w:pPr>
+              <w:spacing w:after="0" w:line="259" w:lineRule="auto"/>
+              <w:rPr>
+                <w:rFonts w:hint="eastAsia"/>
+              </w:rPr>
+            </w:pPr>
+            <w:r>
+              <w:rPr>
+                <w:sz w:val="19"/>
+              </w:rPr>
               <w:t>【填写】</w:t>
+            </w:r>
+          </w:p>
+        </w:tc>
+        <w:tc>
+          <w:tcPr>
+            <w:tcW w:w="1984" w:type="dxa"/>
+            <w:shd w:val="clear" w:color="auto" w:fill="F2F6FC"/>
+            <w:tcMar>
+              <w:top w:w="75" w:type="dxa"/>
+              <w:left w:w="90" w:type="dxa"/>
+              <w:bottom w:w="75" w:type="dxa"/>
+              <w:right w:w="90" w:type="dxa"/>
+            </w:tcMar>
+            <w:vAlign w:val="center"/>
+          </w:tcPr>
+          <w:p>
+            <w:pPr>
+              <w:spacing w:after="0" w:line="259" w:lineRule="auto"/>
+              <w:rPr>
+                <w:rFonts w:hint="eastAsia"/>
+              </w:rPr>
+            </w:pPr>
+            <w:r>
+              <w:rPr>
+                <w:sz w:val="19"/>
+              </w:rPr>
+              <w:t>【填写】</w:t>
+            </w:r>
+          </w:p>
+        </w:tc>
+        <w:tc>
+          <w:tcPr>
+            <w:tcW w:w="1701" w:type="dxa"/>
+            <w:shd w:val="clear" w:color="auto" w:fill="F2F6FC"/>
+            <w:tcMar>
+              <w:top w:w="75" w:type="dxa"/>
+              <w:left w:w="90" w:type="dxa"/>
+              <w:bottom w:w="75" w:type="dxa"/>
+              <w:right w:w="90" w:type="dxa"/>
+            </w:tcMar>
+            <w:vAlign w:val="center"/>
+          </w:tcPr>
+          <w:p>
+            <w:pPr>
+              <w:spacing w:after="0" w:line="259" w:lineRule="auto"/>
+              <w:rPr>
+                <w:rFonts w:hint="eastAsia"/>
+              </w:rPr>
+            </w:pPr>
+            <w:r>
+              <w:rPr>
+                <w:sz w:val="19"/>
+              </w:rPr>
+              <w:t>【填写】</w:t>
+            </w:r>
+          </w:p>
+        </w:tc>
+        <w:tc>
+          <w:tcPr>
+            <w:tcW w:w="1984" w:type="dxa"/>
+            <w:shd w:val="clear" w:color="auto" w:fill="F2F6FC"/>
+            <w:tcMar>
+              <w:top w:w="75" w:type="dxa"/>
+              <w:left w:w="90" w:type="dxa"/>
+              <w:bottom w:w="75" w:type="dxa"/>
+              <w:right w:w="90" w:type="dxa"/>
+            </w:tcMar>
+            <w:vAlign w:val="center"/>
+          </w:tcPr>
+          <w:p>
+            <w:pPr>
+              <w:spacing w:after="0" w:line="259" w:lineRule="auto"/>
+              <w:rPr>
+                <w:rFonts w:hint="eastAsia"/>
+              </w:rPr>
+            </w:pPr>
+            <w:r>
+              <w:rPr>
+                <w:sz w:val="19"/>
+              </w:rPr>
+              <w:t>【填写】</w:t>
+            </w:r>
+          </w:p>
+        </w:tc>
+      </w:tr>
+      <w:tr>
+        <w:trPr>
+          <w:cantSplit/>
+          <w:jc w:val="center"/>
+        </w:trPr>
+        <w:tc>
+          <w:tcPr>
+            <w:tcW w:w="1984" w:type="dxa"/>
+            <w:shd w:val="clear" w:color="auto" w:fill="F2F6FC"/>
+            <w:tcMar>
+              <w:top w:w="75" w:type="dxa"/>
+              <w:left w:w="90" w:type="dxa"/>
+              <w:bottom w:w="75" w:type="dxa"/>
+              <w:right w:w="90" w:type="dxa"/>
+            </w:tcMar>
+            <w:vAlign w:val="center"/>
+          </w:tcPr>
+          <w:p>
+            <w:pPr>
+              <w:spacing w:after="0" w:line="259" w:lineRule="auto"/>
+              <w:rPr>
+                <w:rFonts w:hint="eastAsia"/>
+              </w:rPr>
+            </w:pPr>
+            <w:r>
+              <w:rPr>
+                <w:sz w:val="19"/>
+              </w:rPr>
+              <w:t>B：【编号】</w:t>
             </w:r>
           </w:p>
         </w:tc>
@@ -4723,7 +5491,7 @@
         <w:rPr>
           <w:lang w:eastAsia="zh-CN"/>
         </w:rPr>
-        <w:t>本级分析：【与一级默认 RNN 比较；说明共同条件、实际差异、参数量和耗时；结构选择的效果与局限】</w:t>
+        <w:t>设计结论：【先比较A/B，引用指标、参数量、保存轮次与错例说明选择；再与RNN作整体比较。下降或持平也如实报告】</w:t>
       </w:r>
     </w:p>
     <w:p>
@@ -4738,12 +5506,13 @@
         <w:rPr>
           <w:lang w:eastAsia="zh-CN"/>
         </w:rPr>
-        <w:t>结果记录位置：【GRU 运行目录、CSV 和必要图形文件名】</w:t>
+        <w:t>记录位置：【A/B运行目录、CSV、检查及设计对照图】。A/B保存轮次：【填写】。</w:t>
       </w:r>
     </w:p>
     <w:p>
       <w:pPr>
         <w:pStyle w:val="1"/>
+        <w:pageBreakBefore/>
         <w:rPr>
           <w:lang w:eastAsia="zh-CN"/>
         </w:rPr>
@@ -4779,7 +5548,7 @@
         <w:rPr>
           <w:lang w:eastAsia="zh-CN"/>
         </w:rPr>
-        <w:t>实验总结：【引用本人结果和图，写主要收获、实际遇到的问题及处理、当前数据和训练预算下的局限。没有报错可写“无”。不要求准确率逐级提高。】</w:t>
+        <w:t>实验总结：【结合真实结果说明调参过程、代码问题、设计选择与局限。未开展等级注明即可；不要求准确率逐级提高】</w:t>
       </w:r>
     </w:p>
     <w:p>
@@ -4794,9 +5563,428 @@
         <w:rPr>
           <w:lang w:eastAsia="zh-CN"/>
         </w:rPr>
-        <w:t>最终测试：【未测 / 固定模型、运行编号和结果】。默认 RUN_FINAL_TEST=False；验证选型后才显式测试，不用测试调参。</w:t>
+        <w:t>正式提交必须最终测试。先根据验证集选定一组，固定seed=42、配置、最佳验证轮次及理由，再开启RUN_FINAL_TEST。不得逐个测试后挑最高分。</w:t>
       </w:r>
     </w:p>
+    <w:tbl>
+      <w:tblPr>
+        <w:tblW w:w="0" w:type="auto"/>
+        <w:jc w:val="center"/>
+        <w:tblBorders>
+          <w:top w:val="single" w:sz="6" w:space="0" w:color="D9D9D9"/>
+          <w:left w:val="single" w:sz="6" w:space="0" w:color="D9D9D9"/>
+          <w:bottom w:val="single" w:sz="6" w:space="0" w:color="D9D9D9"/>
+          <w:right w:val="single" w:sz="6" w:space="0" w:color="D9D9D9"/>
+          <w:insideH w:val="single" w:sz="6" w:space="0" w:color="D9D9D9"/>
+          <w:insideV w:val="single" w:sz="6" w:space="0" w:color="D9D9D9"/>
+        </w:tblBorders>
+        <w:tblLayout w:type="fixed"/>
+        <w:tblLook w:val="04A0" w:firstRow="1" w:lastRow="0" w:firstColumn="1" w:lastColumn="0" w:noHBand="0" w:noVBand="1"/>
+      </w:tblPr>
+      <w:tblGrid>
+        <w:gridCol w:w="3969"/>
+        <w:gridCol w:w="5669"/>
+      </w:tblGrid>
+      <w:tr>
+        <w:trPr>
+          <w:cantSplit/>
+          <w:tblHeader/>
+          <w:jc w:val="center"/>
+        </w:trPr>
+        <w:tc>
+          <w:tcPr>
+            <w:tcW w:w="3969" w:type="dxa"/>
+            <w:shd w:val="clear" w:color="auto" w:fill="17365D"/>
+            <w:tcMar>
+              <w:top w:w="75" w:type="dxa"/>
+              <w:left w:w="90" w:type="dxa"/>
+              <w:bottom w:w="75" w:type="dxa"/>
+              <w:right w:w="90" w:type="dxa"/>
+            </w:tcMar>
+            <w:vAlign w:val="center"/>
+          </w:tcPr>
+          <w:p>
+            <w:pPr>
+              <w:spacing w:after="0" w:line="259" w:lineRule="auto"/>
+              <w:jc w:val="center"/>
+              <w:rPr>
+                <w:rFonts w:hint="eastAsia"/>
+              </w:rPr>
+            </w:pPr>
+            <w:proofErr w:type="spellStart"/>
+            <w:r>
+              <w:rPr>
+                <w:b/>
+                <w:color w:val="FFFFFF"/>
+                <w:sz w:val="19"/>
+              </w:rPr>
+              <w:t>正式提交记录</w:t>
+            </w:r>
+            <w:proofErr w:type="spellEnd"/>
+          </w:p>
+        </w:tc>
+        <w:tc>
+          <w:tcPr>
+            <w:tcW w:w="5669" w:type="dxa"/>
+            <w:shd w:val="clear" w:color="auto" w:fill="17365D"/>
+            <w:tcMar>
+              <w:top w:w="75" w:type="dxa"/>
+              <w:left w:w="90" w:type="dxa"/>
+              <w:bottom w:w="75" w:type="dxa"/>
+              <w:right w:w="90" w:type="dxa"/>
+            </w:tcMar>
+            <w:vAlign w:val="center"/>
+          </w:tcPr>
+          <w:p>
+            <w:pPr>
+              <w:spacing w:after="0" w:line="259" w:lineRule="auto"/>
+              <w:jc w:val="center"/>
+              <w:rPr>
+                <w:rFonts w:hint="eastAsia"/>
+              </w:rPr>
+            </w:pPr>
+            <w:r>
+              <w:rPr>
+                <w:b/>
+                <w:color w:val="FFFFFF"/>
+                <w:sz w:val="19"/>
+              </w:rPr>
+              <w:t>填写内容</w:t>
+            </w:r>
+          </w:p>
+        </w:tc>
+      </w:tr>
+      <w:tr>
+        <w:trPr>
+          <w:cantSplit/>
+          <w:jc w:val="center"/>
+        </w:trPr>
+        <w:tc>
+          <w:tcPr>
+            <w:tcW w:w="3969" w:type="dxa"/>
+            <w:shd w:val="clear" w:color="auto" w:fill="F2F6FC"/>
+            <w:tcMar>
+              <w:top w:w="75" w:type="dxa"/>
+              <w:left w:w="90" w:type="dxa"/>
+              <w:bottom w:w="75" w:type="dxa"/>
+              <w:right w:w="90" w:type="dxa"/>
+            </w:tcMar>
+            <w:vAlign w:val="center"/>
+          </w:tcPr>
+          <w:p>
+            <w:pPr>
+              <w:spacing w:after="0" w:line="259" w:lineRule="auto"/>
+              <w:rPr>
+                <w:rFonts w:hint="eastAsia"/>
+              </w:rPr>
+            </w:pPr>
+            <w:r>
+              <w:rPr>
+                <w:sz w:val="19"/>
+              </w:rPr>
+              <w:t>所选模型编号 / 所属等级</w:t>
+            </w:r>
+          </w:p>
+        </w:tc>
+        <w:tc>
+          <w:tcPr>
+            <w:tcW w:w="5669" w:type="dxa"/>
+            <w:shd w:val="clear" w:color="auto" w:fill="F2F6FC"/>
+            <w:tcMar>
+              <w:top w:w="75" w:type="dxa"/>
+              <w:left w:w="90" w:type="dxa"/>
+              <w:bottom w:w="75" w:type="dxa"/>
+              <w:right w:w="90" w:type="dxa"/>
+            </w:tcMar>
+            <w:vAlign w:val="center"/>
+          </w:tcPr>
+          <w:p>
+            <w:pPr>
+              <w:spacing w:after="0" w:line="259" w:lineRule="auto"/>
+              <w:rPr>
+                <w:rFonts w:hint="eastAsia"/>
+                <w:lang w:eastAsia="zh-CN"/>
+              </w:rPr>
+            </w:pPr>
+            <w:r>
+              <w:rPr>
+                <w:sz w:val="19"/>
+                <w:lang w:eastAsia="zh-CN"/>
+              </w:rPr>
+              <w:t>【填写】</w:t>
+            </w:r>
+          </w:p>
+        </w:tc>
+      </w:tr>
+      <w:tr>
+        <w:trPr>
+          <w:cantSplit/>
+          <w:jc w:val="center"/>
+        </w:trPr>
+        <w:tc>
+          <w:tcPr>
+            <w:tcW w:w="3969" w:type="dxa"/>
+            <w:shd w:val="clear" w:color="auto" w:fill="FFFFFF"/>
+            <w:tcMar>
+              <w:top w:w="75" w:type="dxa"/>
+              <w:left w:w="90" w:type="dxa"/>
+              <w:bottom w:w="75" w:type="dxa"/>
+              <w:right w:w="90" w:type="dxa"/>
+            </w:tcMar>
+            <w:vAlign w:val="center"/>
+          </w:tcPr>
+          <w:p>
+            <w:pPr>
+              <w:spacing w:after="0" w:line="259" w:lineRule="auto"/>
+              <w:rPr>
+                <w:rFonts w:hint="eastAsia"/>
+              </w:rPr>
+            </w:pPr>
+            <w:proofErr w:type="spellStart"/>
+            <w:r>
+              <w:rPr>
+                <w:sz w:val="19"/>
+              </w:rPr>
+              <w:t>验证选型理由 / 保存轮次</w:t>
+            </w:r>
+            <w:proofErr w:type="spellEnd"/>
+            <w:r>
+              <w:rPr>
+                <w:sz w:val="19"/>
+              </w:rPr>
+            </w:r>
+            <w:proofErr w:type="spellStart"/>
+            <w:r>
+              <w:rPr>
+                <w:sz w:val="19"/>
+              </w:rPr>
+            </w:r>
+            <w:proofErr w:type="spellEnd"/>
+          </w:p>
+        </w:tc>
+        <w:tc>
+          <w:tcPr>
+            <w:tcW w:w="5669" w:type="dxa"/>
+            <w:shd w:val="clear" w:color="auto" w:fill="FFFFFF"/>
+            <w:tcMar>
+              <w:top w:w="75" w:type="dxa"/>
+              <w:left w:w="90" w:type="dxa"/>
+              <w:bottom w:w="75" w:type="dxa"/>
+              <w:right w:w="90" w:type="dxa"/>
+            </w:tcMar>
+            <w:vAlign w:val="center"/>
+          </w:tcPr>
+          <w:p>
+            <w:pPr>
+              <w:spacing w:after="0" w:line="259" w:lineRule="auto"/>
+              <w:rPr>
+                <w:rFonts w:hint="eastAsia"/>
+                <w:lang w:eastAsia="zh-CN"/>
+              </w:rPr>
+            </w:pPr>
+            <w:r>
+              <w:rPr>
+                <w:sz w:val="19"/>
+                <w:lang w:eastAsia="zh-CN"/>
+              </w:rPr>
+              <w:t>【填写】</w:t>
+            </w:r>
+          </w:p>
+        </w:tc>
+      </w:tr>
+      <w:tr>
+        <w:trPr>
+          <w:cantSplit/>
+          <w:jc w:val="center"/>
+        </w:trPr>
+        <w:tc>
+          <w:tcPr>
+            <w:tcW w:w="3969" w:type="dxa"/>
+            <w:shd w:val="clear" w:color="auto" w:fill="F2F6FC"/>
+            <w:tcMar>
+              <w:top w:w="75" w:type="dxa"/>
+              <w:left w:w="90" w:type="dxa"/>
+              <w:bottom w:w="75" w:type="dxa"/>
+              <w:right w:w="90" w:type="dxa"/>
+            </w:tcMar>
+            <w:vAlign w:val="center"/>
+          </w:tcPr>
+          <w:p>
+            <w:pPr>
+              <w:spacing w:after="0" w:line="259" w:lineRule="auto"/>
+              <w:rPr>
+                <w:rFonts w:hint="eastAsia"/>
+                <w:lang w:eastAsia="zh-CN"/>
+              </w:rPr>
+            </w:pPr>
+            <w:r>
+              <w:rPr>
+                <w:sz w:val="19"/>
+                <w:lang w:eastAsia="zh-CN"/>
+              </w:rPr>
+              <w:t>最终测试Accuracy（%）</w:t>
+            </w:r>
+          </w:p>
+        </w:tc>
+        <w:tc>
+          <w:tcPr>
+            <w:tcW w:w="5669" w:type="dxa"/>
+            <w:shd w:val="clear" w:color="auto" w:fill="F2F6FC"/>
+            <w:tcMar>
+              <w:top w:w="75" w:type="dxa"/>
+              <w:left w:w="90" w:type="dxa"/>
+              <w:bottom w:w="75" w:type="dxa"/>
+              <w:right w:w="90" w:type="dxa"/>
+            </w:tcMar>
+            <w:vAlign w:val="center"/>
+          </w:tcPr>
+          <w:p>
+            <w:pPr>
+              <w:spacing w:after="0" w:line="259" w:lineRule="auto"/>
+              <w:rPr>
+                <w:rFonts w:hint="eastAsia"/>
+                <w:lang w:eastAsia="zh-CN"/>
+              </w:rPr>
+            </w:pPr>
+            <w:r>
+              <w:rPr>
+                <w:sz w:val="19"/>
+                <w:lang w:eastAsia="zh-CN"/>
+              </w:rPr>
+              <w:t>【填写】</w:t>
+            </w:r>
+          </w:p>
+        </w:tc>
+      </w:tr>
+      <w:tr>
+        <w:trPr>
+          <w:cantSplit/>
+          <w:jc w:val="center"/>
+        </w:trPr>
+        <w:tc>
+          <w:tcPr>
+            <w:tcW w:w="3969" w:type="dxa"/>
+            <w:shd w:val="clear" w:color="auto" w:fill="F2F6FC"/>
+            <w:tcMar>
+              <w:top w:w="75" w:type="dxa"/>
+              <w:left w:w="90" w:type="dxa"/>
+              <w:bottom w:w="75" w:type="dxa"/>
+              <w:right w:w="90" w:type="dxa"/>
+            </w:tcMar>
+            <w:vAlign w:val="center"/>
+          </w:tcPr>
+          <w:p>
+            <w:pPr>
+              <w:spacing w:after="0" w:line="259" w:lineRule="auto"/>
+              <w:rPr>
+                <w:rFonts w:hint="eastAsia"/>
+                <w:lang w:eastAsia="zh-CN"/>
+              </w:rPr>
+            </w:pPr>
+            <w:r>
+              <w:rPr>
+                <w:sz w:val="19"/>
+                <w:lang w:eastAsia="zh-CN"/>
+              </w:rPr>
+              <w:t>等级系数 / 折算分</w:t>
+            </w:r>
+          </w:p>
+        </w:tc>
+        <w:tc>
+          <w:tcPr>
+            <w:tcW w:w="5669" w:type="dxa"/>
+            <w:shd w:val="clear" w:color="auto" w:fill="F2F6FC"/>
+            <w:tcMar>
+              <w:top w:w="75" w:type="dxa"/>
+              <w:left w:w="90" w:type="dxa"/>
+              <w:bottom w:w="75" w:type="dxa"/>
+              <w:right w:w="90" w:type="dxa"/>
+            </w:tcMar>
+            <w:vAlign w:val="center"/>
+          </w:tcPr>
+          <w:p>
+            <w:pPr>
+              <w:spacing w:after="0" w:line="259" w:lineRule="auto"/>
+              <w:rPr>
+                <w:rFonts w:hint="eastAsia"/>
+                <w:lang w:eastAsia="zh-CN"/>
+              </w:rPr>
+            </w:pPr>
+            <w:r>
+              <w:rPr>
+                <w:sz w:val="19"/>
+                <w:lang w:eastAsia="zh-CN"/>
+              </w:rPr>
+              <w:t>【填写】</w:t>
+            </w:r>
+          </w:p>
+        </w:tc>
+      </w:tr>
+      <w:tr>
+        <w:trPr>
+          <w:cantSplit/>
+          <w:jc w:val="center"/>
+        </w:trPr>
+        <w:tc>
+          <w:tcPr>
+            <w:tcW w:w="3969" w:type="dxa"/>
+            <w:shd w:val="clear" w:color="auto" w:fill="F2F6FC"/>
+            <w:tcMar>
+              <w:top w:w="75" w:type="dxa"/>
+              <w:left w:w="90" w:type="dxa"/>
+              <w:bottom w:w="75" w:type="dxa"/>
+              <w:right w:w="90" w:type="dxa"/>
+            </w:tcMar>
+            <w:vAlign w:val="center"/>
+          </w:tcPr>
+          <w:p>
+            <w:pPr>
+              <w:spacing w:after="0" w:line="259" w:lineRule="auto"/>
+              <w:rPr>
+                <w:rFonts w:hint="eastAsia"/>
+                <w:lang w:eastAsia="zh-CN"/>
+              </w:rPr>
+            </w:pPr>
+            <w:r>
+              <w:rPr>
+                <w:sz w:val="19"/>
+                <w:lang w:eastAsia="zh-CN"/>
+              </w:rPr>
+              <w:t>冻结记录与测试记录路径</w:t>
+            </w:r>
+          </w:p>
+        </w:tc>
+        <w:tc>
+          <w:tcPr>
+            <w:tcW w:w="5669" w:type="dxa"/>
+            <w:shd w:val="clear" w:color="auto" w:fill="F2F6FC"/>
+            <w:tcMar>
+              <w:top w:w="75" w:type="dxa"/>
+              <w:left w:w="90" w:type="dxa"/>
+              <w:bottom w:w="75" w:type="dxa"/>
+              <w:right w:w="90" w:type="dxa"/>
+            </w:tcMar>
+            <w:vAlign w:val="center"/>
+          </w:tcPr>
+          <w:p>
+            <w:pPr>
+              <w:spacing w:after="0" w:line="259" w:lineRule="auto"/>
+              <w:rPr>
+                <w:rFonts w:hint="eastAsia"/>
+                <w:lang w:eastAsia="zh-CN"/>
+              </w:rPr>
+            </w:pPr>
+            <w:r>
+              <w:rPr>
+                <w:sz w:val="19"/>
+                <w:lang w:eastAsia="zh-CN"/>
+              </w:rPr>
+              <w:t>【填写】</w:t>
+            </w:r>
+          </w:p>
+        </w:tc>
+      </w:tr>
+    </w:tbl>
     <w:p>
       <w:pPr>
         <w:spacing w:after="80" w:line="269" w:lineRule="auto"/>
@@ -4809,7 +5997,7 @@
         <w:rPr>
           <w:lang w:eastAsia="zh-CN"/>
         </w:rPr>
-        <w:t>另存为个人或小组副本，仅提交一份 Word；Notebook、CSV 和图表留作备查。文件名：班级_学号_姓名_RNN实验报告.docx。</w:t>
+        <w:t>主报告文件名：班级_学号_姓名_RNN实验报告.docx。附本人Notebook和all_experiments.csv；模型、预处理、history及检查记录留存备查。</w:t>
       </w:r>
     </w:p>
     <w:p>
@@ -4838,7 +6026,7 @@
         <w:rPr>
           <w:lang w:eastAsia="zh-CN"/>
         </w:rPr>
-        <w:t>□ 封面、分工与等级已填；图表对应本人运行，参考输出已标明。</w:t>
+        <w:t>□ 封面、分工、等级填写完整；结果来自本人运行，参考材料已标注。</w:t>
       </w:r>
     </w:p>
     <w:p>
@@ -4853,7 +6041,22 @@
         <w:rPr>
           <w:lang w:eastAsia="zh-CN"/>
         </w:rPr>
-        <w:t>□ 二、三级按开展情况填写；未用测试调参；重新打开后图文与数值完整。</w:t>
+        <w:t>□ 已完成所属等级要求；正式测试对应冻结模型；Word、Notebook、CSV一致。</w:t>
+      </w:r>
+    </w:p>
+    <w:p>
+      <w:pPr>
+        <w:spacing w:after="0" w:line="269" w:lineRule="auto"/>
+        <w:rPr>
+          <w:rFonts w:hint="eastAsia"/>
+          <w:lang w:eastAsia="zh-CN"/>
+        </w:rPr>
+      </w:pPr>
+      <w:r>
+        <w:rPr>
+          <w:lang w:eastAsia="zh-CN"/>
+        </w:rPr>
+        <w:t>□ 教师核验独立实现与等级后确认成绩；F1、Loss、参数量、耗时不另加权，参考结果不计分。</w:t>
       </w:r>
     </w:p>
     <w:sectPr>

</xml_diff>